<commit_message>
Property market snapshot 2026-10-15
</commit_message>
<xml_diff>
--- a/data/Lagos_Abuja_Property_Market_Intelligence_2026-10-15.docx
+++ b/data/Lagos_Abuja_Property_Market_Intelligence_2026-10-15.docx
@@ -95,7 +95,7 @@
           </w:tcPr>
           <w:p>
             <w:r>
-              <w:t>364</w:t>
+              <w:t>336</w:t>
             </w:r>
           </w:p>
         </w:tc>
@@ -105,7 +105,7 @@
           </w:tcPr>
           <w:p>
             <w:r>
-              <w:t>↑ 134.8%</w:t>
+              <w:t>↑ 116.8%</w:t>
             </w:r>
           </w:p>
         </w:tc>
@@ -191,7 +191,7 @@
           </w:tcPr>
           <w:p>
             <w:r>
-              <w:t>323</w:t>
+              <w:t>23</w:t>
             </w:r>
           </w:p>
         </w:tc>
@@ -319,7 +319,7 @@
           </w:tcPr>
           <w:p>
             <w:r>
-              <w:t>₦26,000,000</w:t>
+              <w:t>₦20,000,000</w:t>
             </w:r>
           </w:p>
         </w:tc>
@@ -329,7 +329,7 @@
           </w:tcPr>
           <w:p>
             <w:r>
-              <w:t>↑ 4.0%</w:t>
+              <w:t>↓ 20.0%</w:t>
             </w:r>
           </w:p>
         </w:tc>
@@ -351,7 +351,7 @@
           </w:tcPr>
           <w:p>
             <w:r>
-              <w:t>₦1,565,027</w:t>
+              <w:t>₦1,515,027</w:t>
             </w:r>
           </w:p>
         </w:tc>
@@ -361,7 +361,7 @@
           </w:tcPr>
           <w:p>
             <w:r>
-              <w:t>↓ 60.9%</w:t>
+              <w:t>↓ 62.1%</w:t>
             </w:r>
           </w:p>
         </w:tc>
@@ -382,32 +382,32 @@
     </w:p>
     <w:p>
       <w:r>
-        <w:t>Median annual apartment rent increased 4.0% week on week.</w:t>
+        <w:t>Median annual apartment rent decreased 20.0% week on week.</w:t>
       </w:r>
     </w:p>
     <w:p>
       <w:r>
-        <w:t>Median land asking price per sqm decreased 60.9% week on week.</w:t>
+        <w:t>Median land asking price per sqm decreased 62.1% week on week.</w:t>
       </w:r>
     </w:p>
     <w:p>
       <w:r>
-        <w:t>The scan captured 209 more validated comparable listings than the previous snapshot.</w:t>
+        <w:t>The scan captured 181 more validated comparable listings than the previous snapshot.</w:t>
       </w:r>
     </w:p>
     <w:p>
       <w:r>
-        <w:t>The deepest validated comparable coverage this week is in Lekki Phase 1, Old Ikoyi, Victoria Island.</w:t>
+        <w:t>The deepest validated comparable coverage this week is in Lekki Phase 1, Victoria Island, Old Ikoyi.</w:t>
       </w:r>
     </w:p>
     <w:p>
       <w:r>
-        <w:t>Thin coverage in Maitama, Ikeja GRA, Asokoro means those areas should be treated as watchlist signals rather than firm pricing conclusions.</w:t>
+        <w:t>Thin coverage in Maitama, Ikeja GRA, Banana Island means those areas should be treated as watchlist signals rather than firm pricing conclusions.</w:t>
       </w:r>
     </w:p>
     <w:p>
       <w:r>
-        <w:t>Maitama currently shows the strongest rental pricing/yield proxy among areas with usable observations.</w:t>
+        <w:t>Asokoro currently shows the strongest rental pricing/yield proxy among areas with usable observations.</w:t>
       </w:r>
     </w:p>
     <w:p>
@@ -446,7 +446,7 @@
         <w:pStyle w:val="ListBullet"/>
       </w:pPr>
       <w:r>
-        <w:t>Strongest rental pricing / yield proxy: Maitama</w:t>
+        <w:t>Strongest rental pricing / yield proxy: Asokoro</w:t>
       </w:r>
     </w:p>
     <w:p>
@@ -467,7 +467,7 @@
     </w:p>
     <w:p>
       <w:r>
-        <w:t>Watch closely: Maitama, Ikeja GRA, Asokoro</w:t>
+        <w:t>Watch closely: Maitama, Ikeja GRA, Banana Island</w:t>
       </w:r>
     </w:p>
     <w:p>
@@ -480,37 +480,37 @@
     </w:p>
     <w:p>
       <w:r>
-        <w:t>Banana Island: 55 comparables; 3BR sale ₦900,000,000; 3BR rent ₦50,000,000; sale ₦/sqm N/A; land ₦/sqm ₦5,250,000.</w:t>
+        <w:t>Banana Island: 36 comparables; 3BR sale ₦900,000,000; 3BR rent ₦50,000,000; sale ₦/sqm N/A; land ₦/sqm ₦5,250,000.</w:t>
       </w:r>
     </w:p>
     <w:p>
       <w:r>
-        <w:t>Old Ikoyi: 63 comparables; 3BR sale ₦700,000,000; 3BR rent ₦40,000,000; sale ₦/sqm ₦8,060,606; land ₦/sqm ₦4,500,000.</w:t>
+        <w:t>Old Ikoyi: 50 comparables; 3BR sale ₦750,000,000; 3BR rent ₦40,000,000; sale ₦/sqm ₦8,060,606; land ₦/sqm ₦4,500,000.</w:t>
       </w:r>
     </w:p>
     <w:p>
       <w:r>
-        <w:t>Lekki Phase 1: 94 comparables; 3BR sale ₦420,000,000; 3BR rent ₦21,000,000; sale ₦/sqm N/A; land ₦/sqm ₦850,000.</w:t>
+        <w:t>Lekki Phase 1: 93 comparables; 3BR sale ₦410,000,000; 3BR rent ₦21,000,000; sale ₦/sqm N/A; land ₦/sqm ₦850,000.</w:t>
       </w:r>
     </w:p>
     <w:p>
       <w:r>
-        <w:t>Victoria Island: 60 comparables; 3BR sale ₦460,000,000; 3BR rent ₦22,500,000; sale ₦/sqm ₦3,829,787; land ₦/sqm ₦2,307,895.</w:t>
+        <w:t>Victoria Island: 60 comparables; 3BR sale ₦460,000,000; 3BR rent ₦20,000,000; sale ₦/sqm ₦3,829,787; land ₦/sqm ₦2,307,895.</w:t>
       </w:r>
     </w:p>
     <w:p>
       <w:r>
-        <w:t>Ikeja GRA: 27 comparables; 3BR sale ₦400,000,000; 3BR rent ₦35,000,000; sale ₦/sqm N/A; land ₦/sqm ₦1,970,865.</w:t>
+        <w:t>Ikeja GRA: 28 comparables; 3BR sale ₦400,000,000; 3BR rent ₦35,000,000; sale ₦/sqm N/A; land ₦/sqm ₦1,970,865.</w:t>
       </w:r>
     </w:p>
     <w:p>
       <w:r>
-        <w:t>Asokoro: 50 comparables; 3BR sale ₦195,000,000; 3BR rent ₦20,000,000; sale ₦/sqm N/A; land ₦/sqm ₦466,667.</w:t>
+        <w:t>Asokoro: 50 comparables; 3BR sale ₦195,000,000; 3BR rent ₦20,000,000; sale ₦/sqm N/A; land ₦/sqm ₦441,667.</w:t>
       </w:r>
     </w:p>
     <w:p>
       <w:r>
-        <w:t>Maitama: 15 comparables; 3BR sale ₦348,000,000; 3BR rent ₦40,000,000; sale ₦/sqm N/A; land ₦/sqm ₦1,833,333.</w:t>
+        <w:t>Maitama: 19 comparables; 3BR sale ₦348,000,000; 3BR rent ₦30,000,000; sale ₦/sqm N/A; land ₦/sqm ₦1,833,333.</w:t>
       </w:r>
     </w:p>
     <w:p>
@@ -534,7 +534,7 @@
         <w:pStyle w:val="ListBullet"/>
       </w:pPr>
       <w:r>
-        <w:t>Old Ikoyi: sale -30.0%, rent +14.3%, land ₦/sqm +2.3%</w:t>
+        <w:t>Old Ikoyi: sale -25.0%, rent +14.3%, land ₦/sqm +2.3%</w:t>
       </w:r>
     </w:p>
     <w:p>
@@ -542,7 +542,7 @@
         <w:pStyle w:val="ListBullet"/>
       </w:pPr>
       <w:r>
-        <w:t>Lekki Phase 1: sale -23.6%, rent +13.5%, land ₦/sqm -57.5%</w:t>
+        <w:t>Lekki Phase 1: sale -25.5%, rent +13.5%, land ₦/sqm -57.5%</w:t>
       </w:r>
     </w:p>
     <w:p>
@@ -566,7 +566,7 @@
         <w:pStyle w:val="ListBullet"/>
       </w:pPr>
       <w:r>
-        <w:t>Asokoro: sale -4.9%, land ₦/sqm -41.1%</w:t>
+        <w:t>Asokoro: sale -4.9%, land ₦/sqm -44.3%</w:t>
       </w:r>
     </w:p>
     <w:p>

</xml_diff>